<commit_message>
docs: inject real project UI photos into report and align layout descriptions
</commit_message>
<xml_diff>
--- a/SMART_KNOWLEDGE_BASE_AGENT_REPORT_44110216.docx
+++ b/SMART_KNOWLEDGE_BASE_AGENT_REPORT_44110216.docx
@@ -4291,7 +4291,7 @@
                 <w:b w:val="0"/>
                 <w:sz w:val="19"/>
               </w:rPr>
-              <w:t>Live Web Dashboard &amp; Interactive AI Agent Chat Workspace (Smart Knowledge Base Agent)</w:t>
+              <w:t>Live Web Dashboard &amp; Interactive AI Agent Chat Workspace (With 1-Click Starter Chips &amp; Search Bar)</w:t>
             </w:r>
           </w:p>
         </w:tc>
@@ -4371,7 +4371,7 @@
                 <w:b w:val="0"/>
                 <w:sz w:val="19"/>
               </w:rPr>
-              <w:t>Knowledge Library &amp; Side-by-Side Reading Desk Citation View</w:t>
+              <w:t>Multi-Topic Document Classification Desk &amp; Dynamic Icon Branding Cards</w:t>
             </w:r>
           </w:p>
         </w:tc>
@@ -4451,7 +4451,7 @@
                 <w:b w:val="0"/>
                 <w:sz w:val="19"/>
               </w:rPr>
-              <w:t>Controls &amp; Settings Administration Panel (FastAPI, ChromaDB &amp; SQLite Health)</w:t>
+              <w:t>Natural Language Engine Configuration &amp; Offline Model Selection Panel</w:t>
             </w:r>
           </w:p>
         </w:tc>
@@ -10353,7 +10353,7 @@
           <w:sz w:val="22"/>
           <w:u w:val="none"/>
         </w:rPr>
-        <w:t>Fig 4.2: Live Web Dashboard &amp; Interactive AI Agent Chat Workspace (Smart Knowledge Base Agent)</w:t>
+        <w:t>Fig 4.2: Live Web Dashboard &amp; Interactive AI Agent Chat Workspace (With 1-Click Starter Chips &amp; Search Bar)</w:t>
       </w:r>
     </w:p>
     <w:p>
@@ -10425,7 +10425,7 @@
           <w:sz w:val="22"/>
           <w:u w:val="none"/>
         </w:rPr>
-        <w:t>Fig 4.3: Knowledge Library &amp; Side-by-Side Reading Desk Citation View</w:t>
+        <w:t>Fig 4.3: Multi-Topic Document Classification Desk &amp; Dynamic Icon Branding Cards</w:t>
       </w:r>
     </w:p>
     <w:p>
@@ -10497,7 +10497,7 @@
           <w:sz w:val="22"/>
           <w:u w:val="none"/>
         </w:rPr>
-        <w:t>Fig 4.4: Controls &amp; Settings Administration Panel (FastAPI, ChromaDB &amp; SQLite Health)</w:t>
+        <w:t>Fig 4.4: Natural Language Engine Configuration &amp; Offline Model Selection Panel</w:t>
       </w:r>
     </w:p>
     <w:p>

</xml_diff>